<commit_message>
docs: regenerate submission DOCX with latest URLs/env
</commit_message>
<xml_diff>
--- a/docs/submission/Susi-Air-Fullstack-Technical-Test.docx
+++ b/docs/submission/Susi-Air-Fullstack-Technical-Test.docx
@@ -257,7 +257,7 @@
                 <w:rFonts w:ascii="Calibri" w:hAnsi="Calibri"/>
                 <w:sz w:val="19"/>
               </w:rPr>
-              <w:t>&lt;&lt;GITHUB_REPO_URL&gt;&gt;</w:t>
+              <w:t>https://github.com/syafaatashan/susiair-pilot</w:t>
             </w:r>
           </w:p>
         </w:tc>
@@ -289,7 +289,7 @@
                 <w:rFonts w:ascii="Calibri" w:hAnsi="Calibri"/>
                 <w:sz w:val="19"/>
               </w:rPr>
-              <w:t>&lt;&lt;WEB_APP_URL&gt;&gt;</w:t>
+              <w:t>Deployed by candidate on Vercel — see docs/deployment.md</w:t>
             </w:r>
           </w:p>
         </w:tc>
@@ -321,7 +321,7 @@
                 <w:rFonts w:ascii="Calibri" w:hAnsi="Calibri"/>
                 <w:sz w:val="19"/>
               </w:rPr>
-              <w:t>&lt;&lt;API_URL&gt;&gt;</w:t>
+              <w:t>Deployed by candidate on Render — see docs/deployment.md</w:t>
             </w:r>
           </w:p>
         </w:tc>
@@ -343,7 +343,7 @@
       </w:r>
       <w:r>
         <w:rPr>
-          <w:rFonts w:ascii="Consolas" w:hAnsi="Consolas"/>
+          <w:rFonts w:ascii="Courier New" w:hAnsi="Courier New"/>
           <w:i w:val="0"/>
           <w:sz w:val="20"/>
         </w:rPr>
@@ -359,7 +359,7 @@
       </w:r>
       <w:r>
         <w:rPr>
-          <w:rFonts w:ascii="Consolas" w:hAnsi="Consolas"/>
+          <w:rFonts w:ascii="Courier New" w:hAnsi="Courier New"/>
           <w:i w:val="0"/>
           <w:sz w:val="20"/>
         </w:rPr>
@@ -375,7 +375,7 @@
       </w:r>
       <w:r>
         <w:rPr>
-          <w:rFonts w:ascii="Consolas" w:hAnsi="Consolas"/>
+          <w:rFonts w:ascii="Courier New" w:hAnsi="Courier New"/>
           <w:i w:val="0"/>
           <w:sz w:val="20"/>
         </w:rPr>
@@ -401,7 +401,7 @@
       </w:r>
       <w:r>
         <w:rPr>
-          <w:rFonts w:ascii="Consolas" w:hAnsi="Consolas"/>
+          <w:rFonts w:ascii="Courier New" w:hAnsi="Courier New"/>
           <w:i w:val="0"/>
           <w:sz w:val="20"/>
         </w:rPr>
@@ -417,7 +417,7 @@
       </w:r>
       <w:r>
         <w:rPr>
-          <w:rFonts w:ascii="Consolas" w:hAnsi="Consolas"/>
+          <w:rFonts w:ascii="Courier New" w:hAnsi="Courier New"/>
           <w:i w:val="0"/>
           <w:sz w:val="20"/>
         </w:rPr>
@@ -562,7 +562,7 @@
             <w:r/>
             <w:r>
               <w:rPr>
-                <w:rFonts w:ascii="Consolas" w:hAnsi="Consolas"/>
+                <w:rFonts w:ascii="Courier New" w:hAnsi="Courier New"/>
                 <w:sz w:val="19"/>
               </w:rPr>
               <w:t>{ username, password }</w:t>
@@ -852,7 +852,7 @@
       </w:r>
       <w:r>
         <w:rPr>
-          <w:rFonts w:ascii="Consolas" w:hAnsi="Consolas"/>
+          <w:rFonts w:ascii="Courier New" w:hAnsi="Courier New"/>
           <w:b w:val="0"/>
           <w:sz w:val="21"/>
         </w:rPr>
@@ -890,7 +890,7 @@
       </w:r>
       <w:r>
         <w:rPr>
-          <w:rFonts w:ascii="Consolas" w:hAnsi="Consolas"/>
+          <w:rFonts w:ascii="Courier New" w:hAnsi="Courier New"/>
           <w:b w:val="0"/>
           <w:sz w:val="21"/>
         </w:rPr>
@@ -906,7 +906,7 @@
       </w:r>
       <w:r>
         <w:rPr>
-          <w:rFonts w:ascii="Consolas" w:hAnsi="Consolas"/>
+          <w:rFonts w:ascii="Courier New" w:hAnsi="Courier New"/>
           <w:b w:val="0"/>
           <w:sz w:val="21"/>
         </w:rPr>
@@ -922,7 +922,7 @@
       </w:r>
       <w:r>
         <w:rPr>
-          <w:rFonts w:ascii="Consolas" w:hAnsi="Consolas"/>
+          <w:rFonts w:ascii="Courier New" w:hAnsi="Courier New"/>
           <w:b w:val="0"/>
           <w:sz w:val="21"/>
         </w:rPr>
@@ -960,7 +960,7 @@
       </w:r>
       <w:r>
         <w:rPr>
-          <w:rFonts w:ascii="Consolas" w:hAnsi="Consolas"/>
+          <w:rFonts w:ascii="Courier New" w:hAnsi="Courier New"/>
           <w:b w:val="0"/>
           <w:sz w:val="21"/>
         </w:rPr>
@@ -990,7 +990,7 @@
       </w:r>
       <w:r>
         <w:rPr>
-          <w:rFonts w:ascii="Consolas" w:hAnsi="Consolas"/>
+          <w:rFonts w:ascii="Courier New" w:hAnsi="Courier New"/>
           <w:b w:val="0"/>
           <w:sz w:val="21"/>
         </w:rPr>
@@ -1028,7 +1028,7 @@
       </w:r>
       <w:r>
         <w:rPr>
-          <w:rFonts w:ascii="Consolas" w:hAnsi="Consolas"/>
+          <w:rFonts w:ascii="Courier New" w:hAnsi="Courier New"/>
           <w:b w:val="0"/>
           <w:sz w:val="21"/>
         </w:rPr>
@@ -1044,7 +1044,7 @@
       </w:r>
       <w:r>
         <w:rPr>
-          <w:rFonts w:ascii="Consolas" w:hAnsi="Consolas"/>
+          <w:rFonts w:ascii="Courier New" w:hAnsi="Courier New"/>
           <w:b w:val="0"/>
           <w:sz w:val="21"/>
         </w:rPr>
@@ -1060,7 +1060,7 @@
       </w:r>
       <w:r>
         <w:rPr>
-          <w:rFonts w:ascii="Consolas" w:hAnsi="Consolas"/>
+          <w:rFonts w:ascii="Courier New" w:hAnsi="Courier New"/>
           <w:b w:val="0"/>
           <w:sz w:val="21"/>
         </w:rPr>
@@ -1098,7 +1098,7 @@
       </w:r>
       <w:r>
         <w:rPr>
-          <w:rFonts w:ascii="Consolas" w:hAnsi="Consolas"/>
+          <w:rFonts w:ascii="Courier New" w:hAnsi="Courier New"/>
           <w:b w:val="0"/>
           <w:sz w:val="21"/>
         </w:rPr>
@@ -1194,7 +1194,7 @@
       </w:r>
       <w:r>
         <w:rPr>
-          <w:rFonts w:ascii="Consolas" w:hAnsi="Consolas"/>
+          <w:rFonts w:ascii="Courier New" w:hAnsi="Courier New"/>
           <w:b w:val="0"/>
           <w:sz w:val="21"/>
         </w:rPr>
@@ -1210,7 +1210,7 @@
       </w:r>
       <w:r>
         <w:rPr>
-          <w:rFonts w:ascii="Consolas" w:hAnsi="Consolas"/>
+          <w:rFonts w:ascii="Courier New" w:hAnsi="Courier New"/>
           <w:b w:val="0"/>
           <w:sz w:val="21"/>
         </w:rPr>
@@ -1226,7 +1226,7 @@
       </w:r>
       <w:r>
         <w:rPr>
-          <w:rFonts w:ascii="Consolas" w:hAnsi="Consolas"/>
+          <w:rFonts w:ascii="Courier New" w:hAnsi="Courier New"/>
           <w:b w:val="0"/>
           <w:sz w:val="21"/>
         </w:rPr>
@@ -1286,7 +1286,7 @@
       </w:r>
       <w:r>
         <w:rPr>
-          <w:rFonts w:ascii="Consolas" w:hAnsi="Consolas"/>
+          <w:rFonts w:ascii="Courier New" w:hAnsi="Courier New"/>
           <w:b w:val="0"/>
           <w:sz w:val="21"/>
         </w:rPr>
@@ -1346,7 +1346,7 @@
       </w:r>
       <w:r>
         <w:rPr>
-          <w:rFonts w:ascii="Consolas" w:hAnsi="Consolas"/>
+          <w:rFonts w:ascii="Courier New" w:hAnsi="Courier New"/>
           <w:b w:val="0"/>
           <w:sz w:val="21"/>
         </w:rPr>
@@ -1362,7 +1362,7 @@
       </w:r>
       <w:r>
         <w:rPr>
-          <w:rFonts w:ascii="Consolas" w:hAnsi="Consolas"/>
+          <w:rFonts w:ascii="Courier New" w:hAnsi="Courier New"/>
           <w:b w:val="0"/>
           <w:sz w:val="21"/>
         </w:rPr>
@@ -1427,7 +1427,7 @@
       </w:r>
       <w:r>
         <w:rPr>
-          <w:rFonts w:ascii="Consolas" w:hAnsi="Consolas"/>
+          <w:rFonts w:ascii="Courier New" w:hAnsi="Courier New"/>
           <w:i w:val="0"/>
           <w:sz w:val="20"/>
         </w:rPr>
@@ -1970,7 +1970,7 @@
       </w:r>
       <w:r>
         <w:rPr>
-          <w:rFonts w:ascii="Consolas" w:hAnsi="Consolas"/>
+          <w:rFonts w:ascii="Courier New" w:hAnsi="Courier New"/>
           <w:i w:val="0"/>
           <w:sz w:val="20"/>
         </w:rPr>
@@ -1986,7 +1986,7 @@
       </w:r>
       <w:r>
         <w:rPr>
-          <w:rFonts w:ascii="Consolas" w:hAnsi="Consolas"/>
+          <w:rFonts w:ascii="Courier New" w:hAnsi="Courier New"/>
           <w:i w:val="0"/>
           <w:sz w:val="20"/>
         </w:rPr>
@@ -2002,7 +2002,7 @@
       </w:r>
       <w:r>
         <w:rPr>
-          <w:rFonts w:ascii="Consolas" w:hAnsi="Consolas"/>
+          <w:rFonts w:ascii="Courier New" w:hAnsi="Courier New"/>
           <w:i w:val="0"/>
           <w:sz w:val="20"/>
         </w:rPr>
@@ -2018,7 +2018,7 @@
       </w:r>
       <w:r>
         <w:rPr>
-          <w:rFonts w:ascii="Consolas" w:hAnsi="Consolas"/>
+          <w:rFonts w:ascii="Courier New" w:hAnsi="Courier New"/>
           <w:i w:val="0"/>
           <w:sz w:val="20"/>
         </w:rPr>
@@ -2034,7 +2034,7 @@
       </w:r>
       <w:r>
         <w:rPr>
-          <w:rFonts w:ascii="Consolas" w:hAnsi="Consolas"/>
+          <w:rFonts w:ascii="Courier New" w:hAnsi="Courier New"/>
           <w:i w:val="0"/>
           <w:sz w:val="20"/>
         </w:rPr>
@@ -2050,7 +2050,7 @@
       </w:r>
       <w:r>
         <w:rPr>
-          <w:rFonts w:ascii="Consolas" w:hAnsi="Consolas"/>
+          <w:rFonts w:ascii="Courier New" w:hAnsi="Courier New"/>
           <w:i w:val="0"/>
           <w:sz w:val="20"/>
         </w:rPr>
@@ -2066,7 +2066,7 @@
       </w:r>
       <w:r>
         <w:rPr>
-          <w:rFonts w:ascii="Consolas" w:hAnsi="Consolas"/>
+          <w:rFonts w:ascii="Courier New" w:hAnsi="Courier New"/>
           <w:i w:val="0"/>
           <w:sz w:val="20"/>
         </w:rPr>
@@ -2101,7 +2101,7 @@
       </w:r>
       <w:r>
         <w:rPr>
-          <w:rFonts w:ascii="Consolas" w:hAnsi="Consolas"/>
+          <w:rFonts w:ascii="Courier New" w:hAnsi="Courier New"/>
           <w:i w:val="0"/>
           <w:sz w:val="20"/>
         </w:rPr>
@@ -2117,7 +2117,7 @@
       </w:r>
       <w:r>
         <w:rPr>
-          <w:rFonts w:ascii="Consolas" w:hAnsi="Consolas"/>
+          <w:rFonts w:ascii="Courier New" w:hAnsi="Courier New"/>
           <w:i w:val="0"/>
           <w:sz w:val="20"/>
         </w:rPr>
@@ -2133,7 +2133,7 @@
       </w:r>
       <w:r>
         <w:rPr>
-          <w:rFonts w:ascii="Consolas" w:hAnsi="Consolas"/>
+          <w:rFonts w:ascii="Courier New" w:hAnsi="Courier New"/>
           <w:i w:val="0"/>
           <w:sz w:val="20"/>
         </w:rPr>
@@ -2168,7 +2168,7 @@
       </w:r>
       <w:r>
         <w:rPr>
-          <w:rFonts w:ascii="Consolas" w:hAnsi="Consolas"/>
+          <w:rFonts w:ascii="Courier New" w:hAnsi="Courier New"/>
           <w:i w:val="0"/>
           <w:sz w:val="20"/>
         </w:rPr>
@@ -2203,7 +2203,7 @@
       </w:r>
       <w:r>
         <w:rPr>
-          <w:rFonts w:ascii="Consolas" w:hAnsi="Consolas"/>
+          <w:rFonts w:ascii="Courier New" w:hAnsi="Courier New"/>
           <w:i w:val="0"/>
           <w:sz w:val="20"/>
         </w:rPr>
@@ -2219,7 +2219,7 @@
       </w:r>
       <w:r>
         <w:rPr>
-          <w:rFonts w:ascii="Consolas" w:hAnsi="Consolas"/>
+          <w:rFonts w:ascii="Courier New" w:hAnsi="Courier New"/>
           <w:i w:val="0"/>
           <w:sz w:val="20"/>
         </w:rPr>
@@ -2294,7 +2294,7 @@
       </w:r>
       <w:r>
         <w:rPr>
-          <w:rFonts w:ascii="Consolas" w:hAnsi="Consolas"/>
+          <w:rFonts w:ascii="Courier New" w:hAnsi="Courier New"/>
           <w:b w:val="0"/>
           <w:sz w:val="21"/>
         </w:rPr>
@@ -2332,7 +2332,7 @@
       </w:r>
       <w:r>
         <w:rPr>
-          <w:rFonts w:ascii="Consolas" w:hAnsi="Consolas"/>
+          <w:rFonts w:ascii="Courier New" w:hAnsi="Courier New"/>
           <w:b w:val="0"/>
           <w:sz w:val="21"/>
         </w:rPr>
@@ -2348,7 +2348,7 @@
       </w:r>
       <w:r>
         <w:rPr>
-          <w:rFonts w:ascii="Consolas" w:hAnsi="Consolas"/>
+          <w:rFonts w:ascii="Courier New" w:hAnsi="Courier New"/>
           <w:b w:val="0"/>
           <w:sz w:val="21"/>
         </w:rPr>
@@ -2386,7 +2386,7 @@
       </w:r>
       <w:r>
         <w:rPr>
-          <w:rFonts w:ascii="Consolas" w:hAnsi="Consolas"/>
+          <w:rFonts w:ascii="Courier New" w:hAnsi="Courier New"/>
           <w:b w:val="0"/>
           <w:sz w:val="21"/>
         </w:rPr>
@@ -2402,7 +2402,7 @@
       </w:r>
       <w:r>
         <w:rPr>
-          <w:rFonts w:ascii="Consolas" w:hAnsi="Consolas"/>
+          <w:rFonts w:ascii="Courier New" w:hAnsi="Courier New"/>
           <w:b w:val="0"/>
           <w:sz w:val="21"/>
         </w:rPr>
@@ -2440,7 +2440,7 @@
       </w:r>
       <w:r>
         <w:rPr>
-          <w:rFonts w:ascii="Consolas" w:hAnsi="Consolas"/>
+          <w:rFonts w:ascii="Courier New" w:hAnsi="Courier New"/>
           <w:b w:val="0"/>
           <w:sz w:val="21"/>
         </w:rPr>
@@ -2456,7 +2456,7 @@
       </w:r>
       <w:r>
         <w:rPr>
-          <w:rFonts w:ascii="Consolas" w:hAnsi="Consolas"/>
+          <w:rFonts w:ascii="Courier New" w:hAnsi="Courier New"/>
           <w:b w:val="0"/>
           <w:sz w:val="21"/>
         </w:rPr>
@@ -2472,7 +2472,7 @@
       </w:r>
       <w:r>
         <w:rPr>
-          <w:rFonts w:ascii="Consolas" w:hAnsi="Consolas"/>
+          <w:rFonts w:ascii="Courier New" w:hAnsi="Courier New"/>
           <w:b w:val="0"/>
           <w:sz w:val="21"/>
         </w:rPr>
@@ -2488,7 +2488,7 @@
       </w:r>
       <w:r>
         <w:rPr>
-          <w:rFonts w:ascii="Consolas" w:hAnsi="Consolas"/>
+          <w:rFonts w:ascii="Courier New" w:hAnsi="Courier New"/>
           <w:b w:val="0"/>
           <w:sz w:val="21"/>
         </w:rPr>
@@ -2500,7 +2500,7 @@
           <w:b w:val="0"/>
           <w:sz w:val="21"/>
         </w:rPr>
-        <w:t>: 16/16 checks.</w:t>
+        <w:t>: 27/27 checks (auth, SSR data, no JWT in HTML, cookie flags, logout, forged-cookie redirect, friendly API-down error).</w:t>
       </w:r>
     </w:p>
     <w:p>
@@ -2526,7 +2526,7 @@
       </w:r>
       <w:r>
         <w:rPr>
-          <w:rFonts w:ascii="Consolas" w:hAnsi="Consolas"/>
+          <w:rFonts w:ascii="Courier New" w:hAnsi="Courier New"/>
           <w:b w:val="0"/>
           <w:sz w:val="21"/>
         </w:rPr>
@@ -2587,7 +2587,7 @@
       </w:r>
       <w:r>
         <w:rPr>
-          <w:rFonts w:ascii="Consolas" w:hAnsi="Consolas"/>
+          <w:rFonts w:ascii="Courier New" w:hAnsi="Courier New"/>
           <w:b w:val="0"/>
           <w:sz w:val="21"/>
         </w:rPr>
@@ -2682,7 +2682,7 @@
       </w:pPr>
       <w:r>
         <w:rPr>
-          <w:rFonts w:ascii="Consolas" w:hAnsi="Consolas"/>
+          <w:rFonts w:ascii="Courier New" w:hAnsi="Courier New"/>
           <w:sz w:val="18"/>
         </w:rPr>
         <w:t># API  -&gt;  http://localhost:3010</w:t>
@@ -2695,7 +2695,7 @@
       </w:pPr>
       <w:r>
         <w:rPr>
-          <w:rFonts w:ascii="Consolas" w:hAnsi="Consolas"/>
+          <w:rFonts w:ascii="Courier New" w:hAnsi="Courier New"/>
           <w:sz w:val="18"/>
         </w:rPr>
         <w:t>cd nest &amp;&amp; npm install &amp;&amp; npm run build</w:t>
@@ -2708,7 +2708,7 @@
       </w:pPr>
       <w:r>
         <w:rPr>
-          <w:rFonts w:ascii="Consolas" w:hAnsi="Consolas"/>
+          <w:rFonts w:ascii="Courier New" w:hAnsi="Courier New"/>
           <w:sz w:val="18"/>
         </w:rPr>
         <w:t>PORT=3010 node dist/main.js</w:t>
@@ -2721,7 +2721,7 @@
       </w:pPr>
       <w:r>
         <w:rPr>
-          <w:rFonts w:ascii="Consolas" w:hAnsi="Consolas"/>
+          <w:rFonts w:ascii="Courier New" w:hAnsi="Courier New"/>
           <w:sz w:val="18"/>
         </w:rPr>
         <w:t>#   PowerShell: $env:PORT="3010"; node dist/main.js</w:t>
@@ -2734,7 +2734,7 @@
       </w:pPr>
       <w:r>
         <w:rPr>
-          <w:rFonts w:ascii="Consolas" w:hAnsi="Consolas"/>
+          <w:rFonts w:ascii="Courier New" w:hAnsi="Courier New"/>
           <w:sz w:val="18"/>
         </w:rPr>
         <w:t xml:space="preserve"> </w:t>
@@ -2747,10 +2747,10 @@
       </w:pPr>
       <w:r>
         <w:rPr>
-          <w:rFonts w:ascii="Consolas" w:hAnsi="Consolas"/>
+          <w:rFonts w:ascii="Courier New" w:hAnsi="Courier New"/>
           <w:sz w:val="18"/>
         </w:rPr>
-        <w:t># Web app  -&gt;  http://localhost:3000   (second terminal)</w:t>
+        <w:t># Web app (Nuxt, SSR)  -&gt;  http://localhost:3020   (port 3000 is taken by 9router/Docker)</w:t>
       </w:r>
     </w:p>
     <w:p>
@@ -2760,10 +2760,10 @@
       </w:pPr>
       <w:r>
         <w:rPr>
-          <w:rFonts w:ascii="Consolas" w:hAnsi="Consolas"/>
+          <w:rFonts w:ascii="Courier New" w:hAnsi="Courier New"/>
           <w:sz w:val="18"/>
         </w:rPr>
-        <w:t>cd nuxt &amp;&amp; npm install</w:t>
+        <w:t>cd nuxt &amp;&amp; npm run build</w:t>
       </w:r>
     </w:p>
     <w:p>
@@ -2773,10 +2773,23 @@
       </w:pPr>
       <w:r>
         <w:rPr>
-          <w:rFonts w:ascii="Consolas" w:hAnsi="Consolas"/>
+          <w:rFonts w:ascii="Courier New" w:hAnsi="Courier New"/>
           <w:sz w:val="18"/>
         </w:rPr>
-        <w:t>NUXT_PUBLIC_API_BASE=http://localhost:3010 npm run dev</w:t>
+        <w:t>NUXT_API_BASE=http://localhost:3010 PORT=3020 node .output/server/index.mjs</w:t>
+      </w:r>
+    </w:p>
+    <w:p>
+      <w:pPr>
+        <w:spacing w:after="0"/>
+        <w:ind w:left="288"/>
+      </w:pPr>
+      <w:r>
+        <w:rPr>
+          <w:rFonts w:ascii="Courier New" w:hAnsi="Courier New"/>
+          <w:sz w:val="18"/>
+        </w:rPr>
+        <w:t>#   or dev:  NUXT_API_BASE=http://localhost:3010 npm run dev -- --port 3020</w:t>
       </w:r>
     </w:p>
     <w:p>
@@ -2796,7 +2809,7 @@
       </w:r>
       <w:r>
         <w:rPr>
-          <w:rFonts w:ascii="Consolas" w:hAnsi="Consolas"/>
+          <w:rFonts w:ascii="Courier New" w:hAnsi="Courier New"/>
           <w:i w:val="0"/>
           <w:sz w:val="20"/>
         </w:rPr>
@@ -2812,7 +2825,7 @@
       </w:r>
       <w:r>
         <w:rPr>
-          <w:rFonts w:ascii="Consolas" w:hAnsi="Consolas"/>
+          <w:rFonts w:ascii="Courier New" w:hAnsi="Courier New"/>
           <w:i w:val="0"/>
           <w:sz w:val="20"/>
         </w:rPr>

</xml_diff>

<commit_message>
docs: regenerate submission DOCX+PDF with live URLs (repo/web/api)
</commit_message>
<xml_diff>
--- a/docs/submission/Susi-Air-Fullstack-Technical-Test.docx
+++ b/docs/submission/Susi-Air-Fullstack-Technical-Test.docx
@@ -289,7 +289,7 @@
                 <w:rFonts w:ascii="Calibri" w:hAnsi="Calibri"/>
                 <w:sz w:val="19"/>
               </w:rPr>
-              <w:t>Deployed by candidate on Vercel — see docs/deployment.md</w:t>
+              <w:t>https://susiair-pilot.vercel.app</w:t>
             </w:r>
           </w:p>
         </w:tc>
@@ -321,7 +321,7 @@
                 <w:rFonts w:ascii="Calibri" w:hAnsi="Calibri"/>
                 <w:sz w:val="19"/>
               </w:rPr>
-              <w:t>Deployed by candidate on Render — see docs/deployment.md</w:t>
+              <w:t>https://susiair-pilot-api.onrender.com</w:t>
             </w:r>
           </w:p>
         </w:tc>

</xml_diff>